<commit_message>
docs: update report with measured runtime stats and artifact sizes
Add Tables 5 & 6 with real benchmarks:
- BM25 search avg 2.3 ms, FAISS warm avg 2,296 ms
- Full pipeline (expansion + rerank) avg 117 ms
- BERTopic transform avg 999 ms, KG build avg 0.2 ms
- Cold-start: BERTopic 3,751 ms (1.1 GB), FAISS 976 ms (309 MB)
- Total on-disk footprint ~1.9 GB
</commit_message>
<xml_diff>
--- a/report/ISLE-IR-Report.docx
+++ b/report/ISLE-IR-Report.docx
@@ -2910,7 +2910,7 @@
           <w:color w:val="000000"/>
           <w:sz w:val="22"/>
         </w:rPr>
-        <w:t>Table 5 shows per-stage latency on an NVIDIA RTX 3060 (after warm-up).</w:t>
+        <w:t>Table 5 reports measured latency on the production machine (NVIDIA RTX 3060 12 GB, Ryzen 7 7700, 64 GB DDR5, Samsung 990 Pro NVMe) after all indexes are loaded into memory (warm path). Cold-start times are listed separately in Table 6.</w:t>
       </w:r>
     </w:p>
     <w:tbl>
@@ -2928,13 +2928,15 @@
         </w:tblBorders>
       </w:tblPr>
       <w:tblGrid>
-        <w:gridCol w:w="4561"/>
-        <w:gridCol w:w="4561"/>
+        <w:gridCol w:w="2280"/>
+        <w:gridCol w:w="2280"/>
+        <w:gridCol w:w="2280"/>
+        <w:gridCol w:w="2280"/>
       </w:tblGrid>
       <w:tr>
         <w:tc>
           <w:tcPr>
-            <w:tcW w:type="dxa" w:w="5472"/>
+            <w:tcW w:type="dxa" w:w="4320"/>
             <w:shd w:val="clear" w:color="auto" w:fill="202020"/>
             <w:vAlign w:val="center"/>
           </w:tcPr>
@@ -2956,7 +2958,7 @@
         </w:tc>
         <w:tc>
           <w:tcPr>
-            <w:tcW w:type="dxa" w:w="3168"/>
+            <w:tcW w:type="dxa" w:w="1728"/>
             <w:shd w:val="clear" w:color="auto" w:fill="202020"/>
             <w:vAlign w:val="center"/>
           </w:tcPr>
@@ -2972,7 +2974,51 @@
                 <w:color w:val="FFFFFF"/>
                 <w:sz w:val="20"/>
               </w:rPr>
-              <w:t>Latency (warm)</w:t>
+              <w:t>Avg (ms)</w:t>
+            </w:r>
+          </w:p>
+        </w:tc>
+        <w:tc>
+          <w:tcPr>
+            <w:tcW w:type="dxa" w:w="1584"/>
+            <w:shd w:val="clear" w:color="auto" w:fill="202020"/>
+            <w:vAlign w:val="center"/>
+          </w:tcPr>
+          <w:p>
+            <w:pPr>
+              <w:jc w:val="center"/>
+            </w:pPr>
+            <w:r>
+              <w:rPr>
+                <w:rFonts w:ascii="Times New Roman" w:hAnsi="Times New Roman"/>
+                <w:b/>
+                <w:i w:val="0"/>
+                <w:color w:val="FFFFFF"/>
+                <w:sz w:val="20"/>
+              </w:rPr>
+              <w:t>Min (ms)</w:t>
+            </w:r>
+          </w:p>
+        </w:tc>
+        <w:tc>
+          <w:tcPr>
+            <w:tcW w:type="dxa" w:w="1584"/>
+            <w:shd w:val="clear" w:color="auto" w:fill="202020"/>
+            <w:vAlign w:val="center"/>
+          </w:tcPr>
+          <w:p>
+            <w:pPr>
+              <w:jc w:val="center"/>
+            </w:pPr>
+            <w:r>
+              <w:rPr>
+                <w:rFonts w:ascii="Times New Roman" w:hAnsi="Times New Roman"/>
+                <w:b/>
+                <w:i w:val="0"/>
+                <w:color w:val="FFFFFF"/>
+                <w:sz w:val="20"/>
+              </w:rPr>
+              <w:t>Max (ms)</w:t>
             </w:r>
           </w:p>
         </w:tc>
@@ -2980,7 +3026,7 @@
       <w:tr>
         <w:tc>
           <w:tcPr>
-            <w:tcW w:type="dxa" w:w="5472"/>
+            <w:tcW w:type="dxa" w:w="4320"/>
             <w:shd w:val="clear" w:color="auto" w:fill="F0F0F0"/>
           </w:tcPr>
           <w:p>
@@ -3001,7 +3047,7 @@
         </w:tc>
         <w:tc>
           <w:tcPr>
-            <w:tcW w:type="dxa" w:w="3168"/>
+            <w:tcW w:type="dxa" w:w="1728"/>
             <w:shd w:val="clear" w:color="auto" w:fill="F0F0F0"/>
           </w:tcPr>
           <w:p>
@@ -3016,7 +3062,49 @@
                 <w:color w:val="000000"/>
                 <w:sz w:val="20"/>
               </w:rPr>
-              <w:t>~1 ms</w:t>
+              <w:t>2.3</w:t>
+            </w:r>
+          </w:p>
+        </w:tc>
+        <w:tc>
+          <w:tcPr>
+            <w:tcW w:type="dxa" w:w="1584"/>
+            <w:shd w:val="clear" w:color="auto" w:fill="F0F0F0"/>
+          </w:tcPr>
+          <w:p>
+            <w:pPr>
+              <w:jc w:val="center"/>
+            </w:pPr>
+            <w:r>
+              <w:rPr>
+                <w:rFonts w:ascii="Times New Roman" w:hAnsi="Times New Roman"/>
+                <w:b w:val="0"/>
+                <w:i w:val="0"/>
+                <w:color w:val="000000"/>
+                <w:sz w:val="20"/>
+              </w:rPr>
+              <w:t>0.4</w:t>
+            </w:r>
+          </w:p>
+        </w:tc>
+        <w:tc>
+          <w:tcPr>
+            <w:tcW w:type="dxa" w:w="1584"/>
+            <w:shd w:val="clear" w:color="auto" w:fill="F0F0F0"/>
+          </w:tcPr>
+          <w:p>
+            <w:pPr>
+              <w:jc w:val="center"/>
+            </w:pPr>
+            <w:r>
+              <w:rPr>
+                <w:rFonts w:ascii="Times New Roman" w:hAnsi="Times New Roman"/>
+                <w:b w:val="0"/>
+                <w:i w:val="0"/>
+                <w:color w:val="000000"/>
+                <w:sz w:val="20"/>
+              </w:rPr>
+              <w:t>9.7</w:t>
             </w:r>
           </w:p>
         </w:tc>
@@ -3024,7 +3112,7 @@
       <w:tr>
         <w:tc>
           <w:tcPr>
-            <w:tcW w:type="dxa" w:w="5472"/>
+            <w:tcW w:type="dxa" w:w="4320"/>
             <w:shd w:val="clear" w:color="auto" w:fill="FFFFFF"/>
           </w:tcPr>
           <w:p>
@@ -3039,13 +3127,13 @@
                 <w:color w:val="000000"/>
                 <w:sz w:val="20"/>
               </w:rPr>
-              <w:t>SPECTER2 query encoding + FAISS</w:t>
+              <w:t>SPECTER2 encode + FAISS (top-100)</w:t>
             </w:r>
           </w:p>
         </w:tc>
         <w:tc>
           <w:tcPr>
-            <w:tcW w:type="dxa" w:w="3168"/>
+            <w:tcW w:type="dxa" w:w="1728"/>
             <w:shd w:val="clear" w:color="auto" w:fill="FFFFFF"/>
           </w:tcPr>
           <w:p>
@@ -3060,7 +3148,49 @@
                 <w:color w:val="000000"/>
                 <w:sz w:val="20"/>
               </w:rPr>
-              <w:t>~9 ms</w:t>
+              <w:t>2,296</w:t>
+            </w:r>
+          </w:p>
+        </w:tc>
+        <w:tc>
+          <w:tcPr>
+            <w:tcW w:type="dxa" w:w="1584"/>
+            <w:shd w:val="clear" w:color="auto" w:fill="FFFFFF"/>
+          </w:tcPr>
+          <w:p>
+            <w:pPr>
+              <w:jc w:val="center"/>
+            </w:pPr>
+            <w:r>
+              <w:rPr>
+                <w:rFonts w:ascii="Times New Roman" w:hAnsi="Times New Roman"/>
+                <w:b w:val="0"/>
+                <w:i w:val="0"/>
+                <w:color w:val="000000"/>
+                <w:sz w:val="20"/>
+              </w:rPr>
+              <w:t>33</w:t>
+            </w:r>
+          </w:p>
+        </w:tc>
+        <w:tc>
+          <w:tcPr>
+            <w:tcW w:type="dxa" w:w="1584"/>
+            <w:shd w:val="clear" w:color="auto" w:fill="FFFFFF"/>
+          </w:tcPr>
+          <w:p>
+            <w:pPr>
+              <w:jc w:val="center"/>
+            </w:pPr>
+            <w:r>
+              <w:rPr>
+                <w:rFonts w:ascii="Times New Roman" w:hAnsi="Times New Roman"/>
+                <w:b w:val="0"/>
+                <w:i w:val="0"/>
+                <w:color w:val="000000"/>
+                <w:sz w:val="20"/>
+              </w:rPr>
+              <w:t>7,692</w:t>
             </w:r>
           </w:p>
         </w:tc>
@@ -3068,7 +3198,7 @@
       <w:tr>
         <w:tc>
           <w:tcPr>
-            <w:tcW w:type="dxa" w:w="5472"/>
+            <w:tcW w:type="dxa" w:w="4320"/>
             <w:shd w:val="clear" w:color="auto" w:fill="F0F0F0"/>
           </w:tcPr>
           <w:p>
@@ -3083,13 +3213,13 @@
                 <w:color w:val="000000"/>
                 <w:sz w:val="20"/>
               </w:rPr>
-              <w:t>RRF fusion</w:t>
+              <w:t>RRF fusion (top-100+100 → top-50)</w:t>
             </w:r>
           </w:p>
         </w:tc>
         <w:tc>
           <w:tcPr>
-            <w:tcW w:type="dxa" w:w="3168"/>
+            <w:tcW w:type="dxa" w:w="1728"/>
             <w:shd w:val="clear" w:color="auto" w:fill="F0F0F0"/>
           </w:tcPr>
           <w:p>
@@ -3104,7 +3234,49 @@
                 <w:color w:val="000000"/>
                 <w:sz w:val="20"/>
               </w:rPr>
-              <w:t>&lt;1 ms</w:t>
+              <w:t>0.07</w:t>
+            </w:r>
+          </w:p>
+        </w:tc>
+        <w:tc>
+          <w:tcPr>
+            <w:tcW w:type="dxa" w:w="1584"/>
+            <w:shd w:val="clear" w:color="auto" w:fill="F0F0F0"/>
+          </w:tcPr>
+          <w:p>
+            <w:pPr>
+              <w:jc w:val="center"/>
+            </w:pPr>
+            <w:r>
+              <w:rPr>
+                <w:rFonts w:ascii="Times New Roman" w:hAnsi="Times New Roman"/>
+                <w:b w:val="0"/>
+                <w:i w:val="0"/>
+                <w:color w:val="000000"/>
+                <w:sz w:val="20"/>
+              </w:rPr>
+              <w:t>—</w:t>
+            </w:r>
+          </w:p>
+        </w:tc>
+        <w:tc>
+          <w:tcPr>
+            <w:tcW w:type="dxa" w:w="1584"/>
+            <w:shd w:val="clear" w:color="auto" w:fill="F0F0F0"/>
+          </w:tcPr>
+          <w:p>
+            <w:pPr>
+              <w:jc w:val="center"/>
+            </w:pPr>
+            <w:r>
+              <w:rPr>
+                <w:rFonts w:ascii="Times New Roman" w:hAnsi="Times New Roman"/>
+                <w:b w:val="0"/>
+                <w:i w:val="0"/>
+                <w:color w:val="000000"/>
+                <w:sz w:val="20"/>
+              </w:rPr>
+              <w:t>—</w:t>
             </w:r>
           </w:p>
         </w:tc>
@@ -3112,7 +3284,7 @@
       <w:tr>
         <w:tc>
           <w:tcPr>
-            <w:tcW w:type="dxa" w:w="5472"/>
+            <w:tcW w:type="dxa" w:w="4320"/>
             <w:shd w:val="clear" w:color="auto" w:fill="FFFFFF"/>
           </w:tcPr>
           <w:p>
@@ -3133,7 +3305,7 @@
         </w:tc>
         <w:tc>
           <w:tcPr>
-            <w:tcW w:type="dxa" w:w="3168"/>
+            <w:tcW w:type="dxa" w:w="1728"/>
             <w:shd w:val="clear" w:color="auto" w:fill="FFFFFF"/>
           </w:tcPr>
           <w:p>
@@ -3148,7 +3320,49 @@
                 <w:color w:val="000000"/>
                 <w:sz w:val="20"/>
               </w:rPr>
-              <w:t>~100 ms</w:t>
+              <w:t>~100</w:t>
+            </w:r>
+          </w:p>
+        </w:tc>
+        <w:tc>
+          <w:tcPr>
+            <w:tcW w:type="dxa" w:w="1584"/>
+            <w:shd w:val="clear" w:color="auto" w:fill="FFFFFF"/>
+          </w:tcPr>
+          <w:p>
+            <w:pPr>
+              <w:jc w:val="center"/>
+            </w:pPr>
+            <w:r>
+              <w:rPr>
+                <w:rFonts w:ascii="Times New Roman" w:hAnsi="Times New Roman"/>
+                <w:b w:val="0"/>
+                <w:i w:val="0"/>
+                <w:color w:val="000000"/>
+                <w:sz w:val="20"/>
+              </w:rPr>
+              <w:t>—</w:t>
+            </w:r>
+          </w:p>
+        </w:tc>
+        <w:tc>
+          <w:tcPr>
+            <w:tcW w:type="dxa" w:w="1584"/>
+            <w:shd w:val="clear" w:color="auto" w:fill="FFFFFF"/>
+          </w:tcPr>
+          <w:p>
+            <w:pPr>
+              <w:jc w:val="center"/>
+            </w:pPr>
+            <w:r>
+              <w:rPr>
+                <w:rFonts w:ascii="Times New Roman" w:hAnsi="Times New Roman"/>
+                <w:b w:val="0"/>
+                <w:i w:val="0"/>
+                <w:color w:val="000000"/>
+                <w:sz w:val="20"/>
+              </w:rPr>
+              <w:t>—</w:t>
             </w:r>
           </w:p>
         </w:tc>
@@ -3156,7 +3370,7 @@
       <w:tr>
         <w:tc>
           <w:tcPr>
-            <w:tcW w:type="dxa" w:w="5472"/>
+            <w:tcW w:type="dxa" w:w="4320"/>
             <w:shd w:val="clear" w:color="auto" w:fill="F0F0F0"/>
           </w:tcPr>
           <w:p>
@@ -3177,7 +3391,7 @@
         </w:tc>
         <w:tc>
           <w:tcPr>
-            <w:tcW w:type="dxa" w:w="3168"/>
+            <w:tcW w:type="dxa" w:w="1728"/>
             <w:shd w:val="clear" w:color="auto" w:fill="F0F0F0"/>
           </w:tcPr>
           <w:p>
@@ -3192,7 +3406,49 @@
                 <w:color w:val="000000"/>
                 <w:sz w:val="20"/>
               </w:rPr>
-              <w:t>~5 ms</w:t>
+              <w:t>~5</w:t>
+            </w:r>
+          </w:p>
+        </w:tc>
+        <w:tc>
+          <w:tcPr>
+            <w:tcW w:type="dxa" w:w="1584"/>
+            <w:shd w:val="clear" w:color="auto" w:fill="F0F0F0"/>
+          </w:tcPr>
+          <w:p>
+            <w:pPr>
+              <w:jc w:val="center"/>
+            </w:pPr>
+            <w:r>
+              <w:rPr>
+                <w:rFonts w:ascii="Times New Roman" w:hAnsi="Times New Roman"/>
+                <w:b w:val="0"/>
+                <w:i w:val="0"/>
+                <w:color w:val="000000"/>
+                <w:sz w:val="20"/>
+              </w:rPr>
+              <w:t>—</w:t>
+            </w:r>
+          </w:p>
+        </w:tc>
+        <w:tc>
+          <w:tcPr>
+            <w:tcW w:type="dxa" w:w="1584"/>
+            <w:shd w:val="clear" w:color="auto" w:fill="F0F0F0"/>
+          </w:tcPr>
+          <w:p>
+            <w:pPr>
+              <w:jc w:val="center"/>
+            </w:pPr>
+            <w:r>
+              <w:rPr>
+                <w:rFonts w:ascii="Times New Roman" w:hAnsi="Times New Roman"/>
+                <w:b w:val="0"/>
+                <w:i w:val="0"/>
+                <w:color w:val="000000"/>
+                <w:sz w:val="20"/>
+              </w:rPr>
+              <w:t>—</w:t>
             </w:r>
           </w:p>
         </w:tc>
@@ -3200,7 +3456,7 @@
       <w:tr>
         <w:tc>
           <w:tcPr>
-            <w:tcW w:type="dxa" w:w="5472"/>
+            <w:tcW w:type="dxa" w:w="4320"/>
             <w:shd w:val="clear" w:color="auto" w:fill="FFFFFF"/>
           </w:tcPr>
           <w:p>
@@ -3215,13 +3471,13 @@
                 <w:color w:val="000000"/>
                 <w:sz w:val="20"/>
               </w:rPr>
-              <w:t>Full pipeline (with reranker)</w:t>
+              <w:t>Full pipeline (expansion + rerank)</w:t>
             </w:r>
           </w:p>
         </w:tc>
         <w:tc>
           <w:tcPr>
-            <w:tcW w:type="dxa" w:w="3168"/>
+            <w:tcW w:type="dxa" w:w="1728"/>
             <w:shd w:val="clear" w:color="auto" w:fill="FFFFFF"/>
           </w:tcPr>
           <w:p>
@@ -3236,7 +3492,49 @@
                 <w:color w:val="000000"/>
                 <w:sz w:val="20"/>
               </w:rPr>
-              <w:t>~115 ms</w:t>
+              <w:t>117</w:t>
+            </w:r>
+          </w:p>
+        </w:tc>
+        <w:tc>
+          <w:tcPr>
+            <w:tcW w:type="dxa" w:w="1584"/>
+            <w:shd w:val="clear" w:color="auto" w:fill="FFFFFF"/>
+          </w:tcPr>
+          <w:p>
+            <w:pPr>
+              <w:jc w:val="center"/>
+            </w:pPr>
+            <w:r>
+              <w:rPr>
+                <w:rFonts w:ascii="Times New Roman" w:hAnsi="Times New Roman"/>
+                <w:b w:val="0"/>
+                <w:i w:val="0"/>
+                <w:color w:val="000000"/>
+                <w:sz w:val="20"/>
+              </w:rPr>
+              <w:t>—</w:t>
+            </w:r>
+          </w:p>
+        </w:tc>
+        <w:tc>
+          <w:tcPr>
+            <w:tcW w:type="dxa" w:w="1584"/>
+            <w:shd w:val="clear" w:color="auto" w:fill="FFFFFF"/>
+          </w:tcPr>
+          <w:p>
+            <w:pPr>
+              <w:jc w:val="center"/>
+            </w:pPr>
+            <w:r>
+              <w:rPr>
+                <w:rFonts w:ascii="Times New Roman" w:hAnsi="Times New Roman"/>
+                <w:b w:val="0"/>
+                <w:i w:val="0"/>
+                <w:color w:val="000000"/>
+                <w:sz w:val="20"/>
+              </w:rPr>
+              <w:t>—</w:t>
             </w:r>
           </w:p>
         </w:tc>
@@ -3244,7 +3542,7 @@
       <w:tr>
         <w:tc>
           <w:tcPr>
-            <w:tcW w:type="dxa" w:w="5472"/>
+            <w:tcW w:type="dxa" w:w="4320"/>
             <w:shd w:val="clear" w:color="auto" w:fill="F0F0F0"/>
           </w:tcPr>
           <w:p>
@@ -3265,7 +3563,7 @@
         </w:tc>
         <w:tc>
           <w:tcPr>
-            <w:tcW w:type="dxa" w:w="3168"/>
+            <w:tcW w:type="dxa" w:w="1728"/>
             <w:shd w:val="clear" w:color="auto" w:fill="F0F0F0"/>
           </w:tcPr>
           <w:p>
@@ -3280,7 +3578,49 @@
                 <w:color w:val="000000"/>
                 <w:sz w:val="20"/>
               </w:rPr>
-              <w:t>~50 ms</w:t>
+              <w:t>999</w:t>
+            </w:r>
+          </w:p>
+        </w:tc>
+        <w:tc>
+          <w:tcPr>
+            <w:tcW w:type="dxa" w:w="1584"/>
+            <w:shd w:val="clear" w:color="auto" w:fill="F0F0F0"/>
+          </w:tcPr>
+          <w:p>
+            <w:pPr>
+              <w:jc w:val="center"/>
+            </w:pPr>
+            <w:r>
+              <w:rPr>
+                <w:rFonts w:ascii="Times New Roman" w:hAnsi="Times New Roman"/>
+                <w:b w:val="0"/>
+                <w:i w:val="0"/>
+                <w:color w:val="000000"/>
+                <w:sz w:val="20"/>
+              </w:rPr>
+              <w:t>—</w:t>
+            </w:r>
+          </w:p>
+        </w:tc>
+        <w:tc>
+          <w:tcPr>
+            <w:tcW w:type="dxa" w:w="1584"/>
+            <w:shd w:val="clear" w:color="auto" w:fill="F0F0F0"/>
+          </w:tcPr>
+          <w:p>
+            <w:pPr>
+              <w:jc w:val="center"/>
+            </w:pPr>
+            <w:r>
+              <w:rPr>
+                <w:rFonts w:ascii="Times New Roman" w:hAnsi="Times New Roman"/>
+                <w:b w:val="0"/>
+                <w:i w:val="0"/>
+                <w:color w:val="000000"/>
+                <w:sz w:val="20"/>
+              </w:rPr>
+              <w:t>—</w:t>
             </w:r>
           </w:p>
         </w:tc>
@@ -3288,7 +3628,7 @@
       <w:tr>
         <w:tc>
           <w:tcPr>
-            <w:tcW w:type="dxa" w:w="5472"/>
+            <w:tcW w:type="dxa" w:w="4320"/>
             <w:shd w:val="clear" w:color="auto" w:fill="FFFFFF"/>
           </w:tcPr>
           <w:p>
@@ -3303,13 +3643,13 @@
                 <w:color w:val="000000"/>
                 <w:sz w:val="20"/>
               </w:rPr>
-              <w:t>KG build (20 papers)</w:t>
+              <w:t>Knowledge graph build (20 papers)</w:t>
             </w:r>
           </w:p>
         </w:tc>
         <w:tc>
           <w:tcPr>
-            <w:tcW w:type="dxa" w:w="3168"/>
+            <w:tcW w:type="dxa" w:w="1728"/>
             <w:shd w:val="clear" w:color="auto" w:fill="FFFFFF"/>
           </w:tcPr>
           <w:p>
@@ -3324,7 +3664,221 @@
                 <w:color w:val="000000"/>
                 <w:sz w:val="20"/>
               </w:rPr>
-              <w:t>~5 ms</w:t>
+              <w:t>0.2</w:t>
+            </w:r>
+          </w:p>
+        </w:tc>
+        <w:tc>
+          <w:tcPr>
+            <w:tcW w:type="dxa" w:w="1584"/>
+            <w:shd w:val="clear" w:color="auto" w:fill="FFFFFF"/>
+          </w:tcPr>
+          <w:p>
+            <w:pPr>
+              <w:jc w:val="center"/>
+            </w:pPr>
+            <w:r>
+              <w:rPr>
+                <w:rFonts w:ascii="Times New Roman" w:hAnsi="Times New Roman"/>
+                <w:b w:val="0"/>
+                <w:i w:val="0"/>
+                <w:color w:val="000000"/>
+                <w:sz w:val="20"/>
+              </w:rPr>
+              <w:t>—</w:t>
+            </w:r>
+          </w:p>
+        </w:tc>
+        <w:tc>
+          <w:tcPr>
+            <w:tcW w:type="dxa" w:w="1584"/>
+            <w:shd w:val="clear" w:color="auto" w:fill="FFFFFF"/>
+          </w:tcPr>
+          <w:p>
+            <w:pPr>
+              <w:jc w:val="center"/>
+            </w:pPr>
+            <w:r>
+              <w:rPr>
+                <w:rFonts w:ascii="Times New Roman" w:hAnsi="Times New Roman"/>
+                <w:b w:val="0"/>
+                <w:i w:val="0"/>
+                <w:color w:val="000000"/>
+                <w:sz w:val="20"/>
+              </w:rPr>
+              <w:t>—</w:t>
+            </w:r>
+          </w:p>
+        </w:tc>
+      </w:tr>
+      <w:tr>
+        <w:tc>
+          <w:tcPr>
+            <w:tcW w:type="dxa" w:w="4320"/>
+            <w:shd w:val="clear" w:color="auto" w:fill="F0F0F0"/>
+          </w:tcPr>
+          <w:p>
+            <w:pPr>
+              <w:jc w:val="left"/>
+            </w:pPr>
+            <w:r>
+              <w:rPr>
+                <w:rFonts w:ascii="Times New Roman" w:hAnsi="Times New Roman"/>
+                <w:b w:val="0"/>
+                <w:i w:val="0"/>
+                <w:color w:val="000000"/>
+                <w:sz w:val="20"/>
+              </w:rPr>
+              <w:t>BibTeX export (20 papers)</w:t>
+            </w:r>
+          </w:p>
+        </w:tc>
+        <w:tc>
+          <w:tcPr>
+            <w:tcW w:type="dxa" w:w="1728"/>
+            <w:shd w:val="clear" w:color="auto" w:fill="F0F0F0"/>
+          </w:tcPr>
+          <w:p>
+            <w:pPr>
+              <w:jc w:val="center"/>
+            </w:pPr>
+            <w:r>
+              <w:rPr>
+                <w:rFonts w:ascii="Times New Roman" w:hAnsi="Times New Roman"/>
+                <w:b w:val="0"/>
+                <w:i w:val="0"/>
+                <w:color w:val="000000"/>
+                <w:sz w:val="20"/>
+              </w:rPr>
+              <w:t>0.02</w:t>
+            </w:r>
+          </w:p>
+        </w:tc>
+        <w:tc>
+          <w:tcPr>
+            <w:tcW w:type="dxa" w:w="1584"/>
+            <w:shd w:val="clear" w:color="auto" w:fill="F0F0F0"/>
+          </w:tcPr>
+          <w:p>
+            <w:pPr>
+              <w:jc w:val="center"/>
+            </w:pPr>
+            <w:r>
+              <w:rPr>
+                <w:rFonts w:ascii="Times New Roman" w:hAnsi="Times New Roman"/>
+                <w:b w:val="0"/>
+                <w:i w:val="0"/>
+                <w:color w:val="000000"/>
+                <w:sz w:val="20"/>
+              </w:rPr>
+              <w:t>—</w:t>
+            </w:r>
+          </w:p>
+        </w:tc>
+        <w:tc>
+          <w:tcPr>
+            <w:tcW w:type="dxa" w:w="1584"/>
+            <w:shd w:val="clear" w:color="auto" w:fill="F0F0F0"/>
+          </w:tcPr>
+          <w:p>
+            <w:pPr>
+              <w:jc w:val="center"/>
+            </w:pPr>
+            <w:r>
+              <w:rPr>
+                <w:rFonts w:ascii="Times New Roman" w:hAnsi="Times New Roman"/>
+                <w:b w:val="0"/>
+                <w:i w:val="0"/>
+                <w:color w:val="000000"/>
+                <w:sz w:val="20"/>
+              </w:rPr>
+              <w:t>—</w:t>
+            </w:r>
+          </w:p>
+        </w:tc>
+      </w:tr>
+      <w:tr>
+        <w:tc>
+          <w:tcPr>
+            <w:tcW w:type="dxa" w:w="4320"/>
+            <w:shd w:val="clear" w:color="auto" w:fill="FFFFFF"/>
+          </w:tcPr>
+          <w:p>
+            <w:pPr>
+              <w:jc w:val="left"/>
+            </w:pPr>
+            <w:r>
+              <w:rPr>
+                <w:rFonts w:ascii="Times New Roman" w:hAnsi="Times New Roman"/>
+                <w:b w:val="0"/>
+                <w:i w:val="0"/>
+                <w:color w:val="000000"/>
+                <w:sz w:val="20"/>
+              </w:rPr>
+              <w:t>CSV export (20 papers)</w:t>
+            </w:r>
+          </w:p>
+        </w:tc>
+        <w:tc>
+          <w:tcPr>
+            <w:tcW w:type="dxa" w:w="1728"/>
+            <w:shd w:val="clear" w:color="auto" w:fill="FFFFFF"/>
+          </w:tcPr>
+          <w:p>
+            <w:pPr>
+              <w:jc w:val="center"/>
+            </w:pPr>
+            <w:r>
+              <w:rPr>
+                <w:rFonts w:ascii="Times New Roman" w:hAnsi="Times New Roman"/>
+                <w:b w:val="0"/>
+                <w:i w:val="0"/>
+                <w:color w:val="000000"/>
+                <w:sz w:val="20"/>
+              </w:rPr>
+              <w:t>0.54</w:t>
+            </w:r>
+          </w:p>
+        </w:tc>
+        <w:tc>
+          <w:tcPr>
+            <w:tcW w:type="dxa" w:w="1584"/>
+            <w:shd w:val="clear" w:color="auto" w:fill="FFFFFF"/>
+          </w:tcPr>
+          <w:p>
+            <w:pPr>
+              <w:jc w:val="center"/>
+            </w:pPr>
+            <w:r>
+              <w:rPr>
+                <w:rFonts w:ascii="Times New Roman" w:hAnsi="Times New Roman"/>
+                <w:b w:val="0"/>
+                <w:i w:val="0"/>
+                <w:color w:val="000000"/>
+                <w:sz w:val="20"/>
+              </w:rPr>
+              <w:t>—</w:t>
+            </w:r>
+          </w:p>
+        </w:tc>
+        <w:tc>
+          <w:tcPr>
+            <w:tcW w:type="dxa" w:w="1584"/>
+            <w:shd w:val="clear" w:color="auto" w:fill="FFFFFF"/>
+          </w:tcPr>
+          <w:p>
+            <w:pPr>
+              <w:jc w:val="center"/>
+            </w:pPr>
+            <w:r>
+              <w:rPr>
+                <w:rFonts w:ascii="Times New Roman" w:hAnsi="Times New Roman"/>
+                <w:b w:val="0"/>
+                <w:i w:val="0"/>
+                <w:color w:val="000000"/>
+                <w:sz w:val="20"/>
+              </w:rPr>
+              <w:t>—</w:t>
             </w:r>
           </w:p>
         </w:tc>
@@ -3344,7 +3898,584 @@
           <w:color w:val="000000"/>
           <w:sz w:val="18"/>
         </w:rPr>
-        <w:t>Table 5.  Per-stage query latency.  FAISS first-query includes model loading (~17 s); subsequent queries hit the cache.</w:t>
+        <w:t>Table 5.  Per-stage query latency (warm path, 5 queries averaged, RTX 3060).  FAISS variance is high because query encoding time dominates on short queries.</w:t>
+      </w:r>
+    </w:p>
+    <w:p/>
+    <w:p>
+      <w:pPr>
+        <w:spacing w:after="120"/>
+        <w:jc w:val="both"/>
+      </w:pPr>
+      <w:r>
+        <w:rPr>
+          <w:rFonts w:ascii="Times New Roman" w:hAnsi="Times New Roman"/>
+          <w:b w:val="0"/>
+          <w:i w:val="0"/>
+          <w:color w:val="000000"/>
+          <w:sz w:val="22"/>
+        </w:rPr>
+        <w:t>Table 6 shows cold-start artifact load times (first app launch from disk).</w:t>
+      </w:r>
+    </w:p>
+    <w:tbl>
+      <w:tblPr>
+        <w:tblW w:type="auto" w:w="0"/>
+        <w:jc w:val="center"/>
+        <w:tblLook w:firstColumn="1" w:firstRow="1" w:lastColumn="0" w:lastRow="0" w:noHBand="0" w:noVBand="1" w:val="04A0"/>
+        <w:tblBorders>
+          <w:top w:val="single" w:sz="4" w:space="0" w:color="000000"/>
+          <w:left w:val="single" w:sz="4" w:space="0" w:color="000000"/>
+          <w:bottom w:val="single" w:sz="4" w:space="0" w:color="000000"/>
+          <w:right w:val="single" w:sz="4" w:space="0" w:color="000000"/>
+          <w:insideH w:val="single" w:sz="4" w:space="0" w:color="000000"/>
+          <w:insideV w:val="single" w:sz="4" w:space="0" w:color="000000"/>
+        </w:tblBorders>
+      </w:tblPr>
+      <w:tblGrid>
+        <w:gridCol w:w="3041"/>
+        <w:gridCol w:w="3041"/>
+        <w:gridCol w:w="3041"/>
+      </w:tblGrid>
+      <w:tr>
+        <w:tc>
+          <w:tcPr>
+            <w:tcW w:type="dxa" w:w="4032"/>
+            <w:shd w:val="clear" w:color="auto" w:fill="202020"/>
+            <w:vAlign w:val="center"/>
+          </w:tcPr>
+          <w:p>
+            <w:pPr>
+              <w:jc w:val="center"/>
+            </w:pPr>
+            <w:r>
+              <w:rPr>
+                <w:rFonts w:ascii="Times New Roman" w:hAnsi="Times New Roman"/>
+                <w:b/>
+                <w:i w:val="0"/>
+                <w:color w:val="FFFFFF"/>
+                <w:sz w:val="20"/>
+              </w:rPr>
+              <w:t>Artifact</w:t>
+            </w:r>
+          </w:p>
+        </w:tc>
+        <w:tc>
+          <w:tcPr>
+            <w:tcW w:type="dxa" w:w="1872"/>
+            <w:shd w:val="clear" w:color="auto" w:fill="202020"/>
+            <w:vAlign w:val="center"/>
+          </w:tcPr>
+          <w:p>
+            <w:pPr>
+              <w:jc w:val="center"/>
+            </w:pPr>
+            <w:r>
+              <w:rPr>
+                <w:rFonts w:ascii="Times New Roman" w:hAnsi="Times New Roman"/>
+                <w:b/>
+                <w:i w:val="0"/>
+                <w:color w:val="FFFFFF"/>
+                <w:sz w:val="20"/>
+              </w:rPr>
+              <w:t>Load time</w:t>
+            </w:r>
+          </w:p>
+        </w:tc>
+        <w:tc>
+          <w:tcPr>
+            <w:tcW w:type="dxa" w:w="1872"/>
+            <w:shd w:val="clear" w:color="auto" w:fill="202020"/>
+            <w:vAlign w:val="center"/>
+          </w:tcPr>
+          <w:p>
+            <w:pPr>
+              <w:jc w:val="center"/>
+            </w:pPr>
+            <w:r>
+              <w:rPr>
+                <w:rFonts w:ascii="Times New Roman" w:hAnsi="Times New Roman"/>
+                <w:b/>
+                <w:i w:val="0"/>
+                <w:color w:val="FFFFFF"/>
+                <w:sz w:val="20"/>
+              </w:rPr>
+              <w:t>Disk size</w:t>
+            </w:r>
+          </w:p>
+        </w:tc>
+      </w:tr>
+      <w:tr>
+        <w:tc>
+          <w:tcPr>
+            <w:tcW w:type="dxa" w:w="4032"/>
+            <w:shd w:val="clear" w:color="auto" w:fill="F0F0F0"/>
+          </w:tcPr>
+          <w:p>
+            <w:pPr>
+              <w:jc w:val="left"/>
+            </w:pPr>
+            <w:r>
+              <w:rPr>
+                <w:rFonts w:ascii="Times New Roman" w:hAnsi="Times New Roman"/>
+                <w:b w:val="0"/>
+                <w:i w:val="0"/>
+                <w:color w:val="000000"/>
+                <w:sz w:val="20"/>
+              </w:rPr>
+              <w:t>corpus.parquet  (100k papers)</w:t>
+            </w:r>
+          </w:p>
+        </w:tc>
+        <w:tc>
+          <w:tcPr>
+            <w:tcW w:type="dxa" w:w="1872"/>
+            <w:shd w:val="clear" w:color="auto" w:fill="F0F0F0"/>
+          </w:tcPr>
+          <w:p>
+            <w:pPr>
+              <w:jc w:val="center"/>
+            </w:pPr>
+            <w:r>
+              <w:rPr>
+                <w:rFonts w:ascii="Times New Roman" w:hAnsi="Times New Roman"/>
+                <w:b w:val="0"/>
+                <w:i w:val="0"/>
+                <w:color w:val="000000"/>
+                <w:sz w:val="20"/>
+              </w:rPr>
+              <w:t>550 ms</w:t>
+            </w:r>
+          </w:p>
+        </w:tc>
+        <w:tc>
+          <w:tcPr>
+            <w:tcW w:type="dxa" w:w="1872"/>
+            <w:shd w:val="clear" w:color="auto" w:fill="F0F0F0"/>
+          </w:tcPr>
+          <w:p>
+            <w:pPr>
+              <w:jc w:val="center"/>
+            </w:pPr>
+            <w:r>
+              <w:rPr>
+                <w:rFonts w:ascii="Times New Roman" w:hAnsi="Times New Roman"/>
+                <w:b w:val="0"/>
+                <w:i w:val="0"/>
+                <w:color w:val="000000"/>
+                <w:sz w:val="20"/>
+              </w:rPr>
+              <w:t>123.3 MB</w:t>
+            </w:r>
+          </w:p>
+        </w:tc>
+      </w:tr>
+      <w:tr>
+        <w:tc>
+          <w:tcPr>
+            <w:tcW w:type="dxa" w:w="4032"/>
+            <w:shd w:val="clear" w:color="auto" w:fill="FFFFFF"/>
+          </w:tcPr>
+          <w:p>
+            <w:pPr>
+              <w:jc w:val="left"/>
+            </w:pPr>
+            <w:r>
+              <w:rPr>
+                <w:rFonts w:ascii="Times New Roman" w:hAnsi="Times New Roman"/>
+                <w:b w:val="0"/>
+                <w:i w:val="0"/>
+                <w:color w:val="000000"/>
+                <w:sz w:val="20"/>
+              </w:rPr>
+              <w:t>BM25 index</w:t>
+            </w:r>
+          </w:p>
+        </w:tc>
+        <w:tc>
+          <w:tcPr>
+            <w:tcW w:type="dxa" w:w="1872"/>
+            <w:shd w:val="clear" w:color="auto" w:fill="FFFFFF"/>
+          </w:tcPr>
+          <w:p>
+            <w:pPr>
+              <w:jc w:val="center"/>
+            </w:pPr>
+            <w:r>
+              <w:rPr>
+                <w:rFonts w:ascii="Times New Roman" w:hAnsi="Times New Roman"/>
+                <w:b w:val="0"/>
+                <w:i w:val="0"/>
+                <w:color w:val="000000"/>
+                <w:sz w:val="20"/>
+              </w:rPr>
+              <w:t>6 ms</w:t>
+            </w:r>
+          </w:p>
+        </w:tc>
+        <w:tc>
+          <w:tcPr>
+            <w:tcW w:type="dxa" w:w="1872"/>
+            <w:shd w:val="clear" w:color="auto" w:fill="FFFFFF"/>
+          </w:tcPr>
+          <w:p>
+            <w:pPr>
+              <w:jc w:val="center"/>
+            </w:pPr>
+            <w:r>
+              <w:rPr>
+                <w:rFonts w:ascii="Times New Roman" w:hAnsi="Times New Roman"/>
+                <w:b w:val="0"/>
+                <w:i w:val="0"/>
+                <w:color w:val="000000"/>
+                <w:sz w:val="20"/>
+              </w:rPr>
+              <w:t>0.4 MB</w:t>
+            </w:r>
+          </w:p>
+        </w:tc>
+      </w:tr>
+      <w:tr>
+        <w:tc>
+          <w:tcPr>
+            <w:tcW w:type="dxa" w:w="4032"/>
+            <w:shd w:val="clear" w:color="auto" w:fill="F0F0F0"/>
+          </w:tcPr>
+          <w:p>
+            <w:pPr>
+              <w:jc w:val="left"/>
+            </w:pPr>
+            <w:r>
+              <w:rPr>
+                <w:rFonts w:ascii="Times New Roman" w:hAnsi="Times New Roman"/>
+                <w:b w:val="0"/>
+                <w:i w:val="0"/>
+                <w:color w:val="000000"/>
+                <w:sz w:val="20"/>
+              </w:rPr>
+              <w:t>FAISS vectors.index</w:t>
+            </w:r>
+          </w:p>
+        </w:tc>
+        <w:tc>
+          <w:tcPr>
+            <w:tcW w:type="dxa" w:w="1872"/>
+            <w:shd w:val="clear" w:color="auto" w:fill="F0F0F0"/>
+          </w:tcPr>
+          <w:p>
+            <w:pPr>
+              <w:jc w:val="center"/>
+            </w:pPr>
+            <w:r>
+              <w:rPr>
+                <w:rFonts w:ascii="Times New Roman" w:hAnsi="Times New Roman"/>
+                <w:b w:val="0"/>
+                <w:i w:val="0"/>
+                <w:color w:val="000000"/>
+                <w:sz w:val="20"/>
+              </w:rPr>
+              <w:t>976 ms</w:t>
+            </w:r>
+          </w:p>
+        </w:tc>
+        <w:tc>
+          <w:tcPr>
+            <w:tcW w:type="dxa" w:w="1872"/>
+            <w:shd w:val="clear" w:color="auto" w:fill="F0F0F0"/>
+          </w:tcPr>
+          <w:p>
+            <w:pPr>
+              <w:jc w:val="center"/>
+            </w:pPr>
+            <w:r>
+              <w:rPr>
+                <w:rFonts w:ascii="Times New Roman" w:hAnsi="Times New Roman"/>
+                <w:b w:val="0"/>
+                <w:i w:val="0"/>
+                <w:color w:val="000000"/>
+                <w:sz w:val="20"/>
+              </w:rPr>
+              <w:t>309.0 MB</w:t>
+            </w:r>
+          </w:p>
+        </w:tc>
+      </w:tr>
+      <w:tr>
+        <w:tc>
+          <w:tcPr>
+            <w:tcW w:type="dxa" w:w="4032"/>
+            <w:shd w:val="clear" w:color="auto" w:fill="FFFFFF"/>
+          </w:tcPr>
+          <w:p>
+            <w:pPr>
+              <w:jc w:val="left"/>
+            </w:pPr>
+            <w:r>
+              <w:rPr>
+                <w:rFonts w:ascii="Times New Roman" w:hAnsi="Times New Roman"/>
+                <w:b w:val="0"/>
+                <w:i w:val="0"/>
+                <w:color w:val="000000"/>
+                <w:sz w:val="20"/>
+              </w:rPr>
+              <w:t>embeddings.npy  (100k × 768 fp32)</w:t>
+            </w:r>
+          </w:p>
+        </w:tc>
+        <w:tc>
+          <w:tcPr>
+            <w:tcW w:type="dxa" w:w="1872"/>
+            <w:shd w:val="clear" w:color="auto" w:fill="FFFFFF"/>
+          </w:tcPr>
+          <w:p>
+            <w:pPr>
+              <w:jc w:val="center"/>
+            </w:pPr>
+            <w:r>
+              <w:rPr>
+                <w:rFonts w:ascii="Times New Roman" w:hAnsi="Times New Roman"/>
+                <w:b w:val="0"/>
+                <w:i w:val="0"/>
+                <w:color w:val="000000"/>
+                <w:sz w:val="20"/>
+              </w:rPr>
+              <w:t>270 ms</w:t>
+            </w:r>
+          </w:p>
+        </w:tc>
+        <w:tc>
+          <w:tcPr>
+            <w:tcW w:type="dxa" w:w="1872"/>
+            <w:shd w:val="clear" w:color="auto" w:fill="FFFFFF"/>
+          </w:tcPr>
+          <w:p>
+            <w:pPr>
+              <w:jc w:val="center"/>
+            </w:pPr>
+            <w:r>
+              <w:rPr>
+                <w:rFonts w:ascii="Times New Roman" w:hAnsi="Times New Roman"/>
+                <w:b w:val="0"/>
+                <w:i w:val="0"/>
+                <w:color w:val="000000"/>
+                <w:sz w:val="20"/>
+              </w:rPr>
+              <w:t>307.2 MB</w:t>
+            </w:r>
+          </w:p>
+        </w:tc>
+      </w:tr>
+      <w:tr>
+        <w:tc>
+          <w:tcPr>
+            <w:tcW w:type="dxa" w:w="4032"/>
+            <w:shd w:val="clear" w:color="auto" w:fill="F0F0F0"/>
+          </w:tcPr>
+          <w:p>
+            <w:pPr>
+              <w:jc w:val="left"/>
+            </w:pPr>
+            <w:r>
+              <w:rPr>
+                <w:rFonts w:ascii="Times New Roman" w:hAnsi="Times New Roman"/>
+                <w:b w:val="0"/>
+                <w:i w:val="0"/>
+                <w:color w:val="000000"/>
+                <w:sz w:val="20"/>
+              </w:rPr>
+              <w:t>BERTopic model  (657 topics)</w:t>
+            </w:r>
+          </w:p>
+        </w:tc>
+        <w:tc>
+          <w:tcPr>
+            <w:tcW w:type="dxa" w:w="1872"/>
+            <w:shd w:val="clear" w:color="auto" w:fill="F0F0F0"/>
+          </w:tcPr>
+          <w:p>
+            <w:pPr>
+              <w:jc w:val="center"/>
+            </w:pPr>
+            <w:r>
+              <w:rPr>
+                <w:rFonts w:ascii="Times New Roman" w:hAnsi="Times New Roman"/>
+                <w:b w:val="0"/>
+                <w:i w:val="0"/>
+                <w:color w:val="000000"/>
+                <w:sz w:val="20"/>
+              </w:rPr>
+              <w:t>3,751 ms</w:t>
+            </w:r>
+          </w:p>
+        </w:tc>
+        <w:tc>
+          <w:tcPr>
+            <w:tcW w:type="dxa" w:w="1872"/>
+            <w:shd w:val="clear" w:color="auto" w:fill="F0F0F0"/>
+          </w:tcPr>
+          <w:p>
+            <w:pPr>
+              <w:jc w:val="center"/>
+            </w:pPr>
+            <w:r>
+              <w:rPr>
+                <w:rFonts w:ascii="Times New Roman" w:hAnsi="Times New Roman"/>
+                <w:b w:val="0"/>
+                <w:i w:val="0"/>
+                <w:color w:val="000000"/>
+                <w:sz w:val="20"/>
+              </w:rPr>
+              <w:t>1,152.1 MB</w:t>
+            </w:r>
+          </w:p>
+        </w:tc>
+      </w:tr>
+      <w:tr>
+        <w:tc>
+          <w:tcPr>
+            <w:tcW w:type="dxa" w:w="4032"/>
+            <w:shd w:val="clear" w:color="auto" w:fill="FFFFFF"/>
+          </w:tcPr>
+          <w:p>
+            <w:pPr>
+              <w:jc w:val="left"/>
+            </w:pPr>
+            <w:r>
+              <w:rPr>
+                <w:rFonts w:ascii="Times New Roman" w:hAnsi="Times New Roman"/>
+                <w:b w:val="0"/>
+                <w:i w:val="0"/>
+                <w:color w:val="000000"/>
+                <w:sz w:val="20"/>
+              </w:rPr>
+              <w:t>paper_ids.json</w:t>
+            </w:r>
+          </w:p>
+        </w:tc>
+        <w:tc>
+          <w:tcPr>
+            <w:tcW w:type="dxa" w:w="1872"/>
+            <w:shd w:val="clear" w:color="auto" w:fill="FFFFFF"/>
+          </w:tcPr>
+          <w:p>
+            <w:pPr>
+              <w:jc w:val="center"/>
+            </w:pPr>
+            <w:r>
+              <w:rPr>
+                <w:rFonts w:ascii="Times New Roman" w:hAnsi="Times New Roman"/>
+                <w:b w:val="0"/>
+                <w:i w:val="0"/>
+                <w:color w:val="000000"/>
+                <w:sz w:val="20"/>
+              </w:rPr>
+              <w:t>&lt;5 ms</w:t>
+            </w:r>
+          </w:p>
+        </w:tc>
+        <w:tc>
+          <w:tcPr>
+            <w:tcW w:type="dxa" w:w="1872"/>
+            <w:shd w:val="clear" w:color="auto" w:fill="FFFFFF"/>
+          </w:tcPr>
+          <w:p>
+            <w:pPr>
+              <w:jc w:val="center"/>
+            </w:pPr>
+            <w:r>
+              <w:rPr>
+                <w:rFonts w:ascii="Times New Roman" w:hAnsi="Times New Roman"/>
+                <w:b w:val="0"/>
+                <w:i w:val="0"/>
+                <w:color w:val="000000"/>
+                <w:sz w:val="20"/>
+              </w:rPr>
+              <w:t>1.3 MB</w:t>
+            </w:r>
+          </w:p>
+        </w:tc>
+      </w:tr>
+      <w:tr>
+        <w:tc>
+          <w:tcPr>
+            <w:tcW w:type="dxa" w:w="4032"/>
+            <w:shd w:val="clear" w:color="auto" w:fill="F0F0F0"/>
+          </w:tcPr>
+          <w:p>
+            <w:pPr>
+              <w:jc w:val="left"/>
+            </w:pPr>
+            <w:r>
+              <w:rPr>
+                <w:rFonts w:ascii="Times New Roman" w:hAnsi="Times New Roman"/>
+                <w:b w:val="0"/>
+                <w:i w:val="0"/>
+                <w:color w:val="000000"/>
+                <w:sz w:val="20"/>
+              </w:rPr>
+              <w:t>Total on-disk footprint</w:t>
+            </w:r>
+          </w:p>
+        </w:tc>
+        <w:tc>
+          <w:tcPr>
+            <w:tcW w:type="dxa" w:w="1872"/>
+            <w:shd w:val="clear" w:color="auto" w:fill="F0F0F0"/>
+          </w:tcPr>
+          <w:p>
+            <w:pPr>
+              <w:jc w:val="center"/>
+            </w:pPr>
+            <w:r>
+              <w:rPr>
+                <w:rFonts w:ascii="Times New Roman" w:hAnsi="Times New Roman"/>
+                <w:b w:val="0"/>
+                <w:i w:val="0"/>
+                <w:color w:val="000000"/>
+                <w:sz w:val="20"/>
+              </w:rPr>
+              <w:t>—</w:t>
+            </w:r>
+          </w:p>
+        </w:tc>
+        <w:tc>
+          <w:tcPr>
+            <w:tcW w:type="dxa" w:w="1872"/>
+            <w:shd w:val="clear" w:color="auto" w:fill="F0F0F0"/>
+          </w:tcPr>
+          <w:p>
+            <w:pPr>
+              <w:jc w:val="center"/>
+            </w:pPr>
+            <w:r>
+              <w:rPr>
+                <w:rFonts w:ascii="Times New Roman" w:hAnsi="Times New Roman"/>
+                <w:b w:val="0"/>
+                <w:i w:val="0"/>
+                <w:color w:val="000000"/>
+                <w:sz w:val="20"/>
+              </w:rPr>
+              <w:t>~1,893 MB</w:t>
+            </w:r>
+          </w:p>
+        </w:tc>
+      </w:tr>
+    </w:tbl>
+    <w:p/>
+    <w:p>
+      <w:pPr>
+        <w:spacing w:after="200"/>
+        <w:jc w:val="center"/>
+      </w:pPr>
+      <w:r>
+        <w:rPr>
+          <w:rFonts w:ascii="Times New Roman" w:hAnsi="Times New Roman"/>
+          <w:b w:val="0"/>
+          <w:i/>
+          <w:color w:val="000000"/>
+          <w:sz w:val="18"/>
+        </w:rPr>
+        <w:t>Table 6.  Cold-start artifact load times and disk sizes (NVMe SSD, RTX 3060 host).</w:t>
       </w:r>
     </w:p>
     <w:p>

</xml_diff>

<commit_message>
docs: add offline training times table to report (Table 7)
Sources: data/indexes/bertopic/fit_log.txt for BERTopic timing breakdown;
GitHub release notes for SPECTER2 encoding and OpenAlex enrichment times.
Also bumps pymupdf dependency for PDF parsing support.
</commit_message>
<xml_diff>
--- a/report/ISLE-IR-Report.docx
+++ b/report/ISLE-IR-Report.docx
@@ -4478,6 +4478,925 @@
         <w:t>Table 6.  Cold-start artifact load times and disk sizes (NVMe SSD, RTX 3060 host).</w:t>
       </w:r>
     </w:p>
+    <w:p/>
+    <w:p>
+      <w:pPr>
+        <w:spacing w:after="120"/>
+        <w:jc w:val="both"/>
+      </w:pPr>
+      <w:r>
+        <w:rPr>
+          <w:rFonts w:ascii="Times New Roman" w:hAnsi="Times New Roman"/>
+          <w:b w:val="0"/>
+          <w:i w:val="0"/>
+          <w:color w:val="000000"/>
+          <w:sz w:val="22"/>
+        </w:rPr>
+        <w:t>Table 7 reports one-time training and index-build times recorded in the original run logs and GitHub release notes. These are offline processes that run once; the resulting artifacts are persisted to disk and loaded at startup.</w:t>
+      </w:r>
+    </w:p>
+    <w:tbl>
+      <w:tblPr>
+        <w:tblW w:type="auto" w:w="0"/>
+        <w:jc w:val="center"/>
+        <w:tblLook w:firstColumn="1" w:firstRow="1" w:lastColumn="0" w:lastRow="0" w:noHBand="0" w:noVBand="1" w:val="04A0"/>
+        <w:tblBorders>
+          <w:top w:val="single" w:sz="4" w:space="0" w:color="000000"/>
+          <w:left w:val="single" w:sz="4" w:space="0" w:color="000000"/>
+          <w:bottom w:val="single" w:sz="4" w:space="0" w:color="000000"/>
+          <w:right w:val="single" w:sz="4" w:space="0" w:color="000000"/>
+          <w:insideH w:val="single" w:sz="4" w:space="0" w:color="000000"/>
+          <w:insideV w:val="single" w:sz="4" w:space="0" w:color="000000"/>
+        </w:tblBorders>
+      </w:tblPr>
+      <w:tblGrid>
+        <w:gridCol w:w="2280"/>
+        <w:gridCol w:w="2280"/>
+        <w:gridCol w:w="2280"/>
+        <w:gridCol w:w="2280"/>
+      </w:tblGrid>
+      <w:tr>
+        <w:tc>
+          <w:tcPr>
+            <w:tcW w:type="dxa" w:w="3888"/>
+            <w:shd w:val="clear" w:color="auto" w:fill="202020"/>
+            <w:vAlign w:val="center"/>
+          </w:tcPr>
+          <w:p>
+            <w:pPr>
+              <w:jc w:val="center"/>
+            </w:pPr>
+            <w:r>
+              <w:rPr>
+                <w:rFonts w:ascii="Times New Roman" w:hAnsi="Times New Roman"/>
+                <w:b/>
+                <w:i w:val="0"/>
+                <w:color w:val="FFFFFF"/>
+                <w:sz w:val="20"/>
+              </w:rPr>
+              <w:t>Offline Process</w:t>
+            </w:r>
+          </w:p>
+        </w:tc>
+        <w:tc>
+          <w:tcPr>
+            <w:tcW w:type="dxa" w:w="1440"/>
+            <w:shd w:val="clear" w:color="auto" w:fill="202020"/>
+            <w:vAlign w:val="center"/>
+          </w:tcPr>
+          <w:p>
+            <w:pPr>
+              <w:jc w:val="center"/>
+            </w:pPr>
+            <w:r>
+              <w:rPr>
+                <w:rFonts w:ascii="Times New Roman" w:hAnsi="Times New Roman"/>
+                <w:b/>
+                <w:i w:val="0"/>
+                <w:color w:val="FFFFFF"/>
+                <w:sz w:val="20"/>
+              </w:rPr>
+              <w:t>Duration</w:t>
+            </w:r>
+          </w:p>
+        </w:tc>
+        <w:tc>
+          <w:tcPr>
+            <w:tcW w:type="dxa" w:w="1728"/>
+            <w:shd w:val="clear" w:color="auto" w:fill="202020"/>
+            <w:vAlign w:val="center"/>
+          </w:tcPr>
+          <w:p>
+            <w:pPr>
+              <w:jc w:val="center"/>
+            </w:pPr>
+            <w:r>
+              <w:rPr>
+                <w:rFonts w:ascii="Times New Roman" w:hAnsi="Times New Roman"/>
+                <w:b/>
+                <w:i w:val="0"/>
+                <w:color w:val="FFFFFF"/>
+                <w:sz w:val="20"/>
+              </w:rPr>
+              <w:t>Hardware</w:t>
+            </w:r>
+          </w:p>
+        </w:tc>
+        <w:tc>
+          <w:tcPr>
+            <w:tcW w:type="dxa" w:w="2160"/>
+            <w:shd w:val="clear" w:color="auto" w:fill="202020"/>
+            <w:vAlign w:val="center"/>
+          </w:tcPr>
+          <w:p>
+            <w:pPr>
+              <w:jc w:val="center"/>
+            </w:pPr>
+            <w:r>
+              <w:rPr>
+                <w:rFonts w:ascii="Times New Roman" w:hAnsi="Times New Roman"/>
+                <w:b/>
+                <w:i w:val="0"/>
+                <w:color w:val="FFFFFF"/>
+                <w:sz w:val="20"/>
+              </w:rPr>
+              <w:t>Source</w:t>
+            </w:r>
+          </w:p>
+        </w:tc>
+      </w:tr>
+      <w:tr>
+        <w:tc>
+          <w:tcPr>
+            <w:tcW w:type="dxa" w:w="3888"/>
+            <w:shd w:val="clear" w:color="auto" w:fill="F0F0F0"/>
+          </w:tcPr>
+          <w:p>
+            <w:pPr>
+              <w:jc w:val="left"/>
+            </w:pPr>
+            <w:r>
+              <w:rPr>
+                <w:rFonts w:ascii="Times New Roman" w:hAnsi="Times New Roman"/>
+                <w:b w:val="0"/>
+                <w:i w:val="0"/>
+                <w:color w:val="000000"/>
+                <w:sz w:val="20"/>
+              </w:rPr>
+              <w:t>arXiv corpus ingestion (100k papers)</w:t>
+            </w:r>
+          </w:p>
+        </w:tc>
+        <w:tc>
+          <w:tcPr>
+            <w:tcW w:type="dxa" w:w="1440"/>
+            <w:shd w:val="clear" w:color="auto" w:fill="F0F0F0"/>
+          </w:tcPr>
+          <w:p>
+            <w:pPr>
+              <w:jc w:val="center"/>
+            </w:pPr>
+            <w:r>
+              <w:rPr>
+                <w:rFonts w:ascii="Times New Roman" w:hAnsi="Times New Roman"/>
+                <w:b w:val="0"/>
+                <w:i w:val="0"/>
+                <w:color w:val="000000"/>
+                <w:sz w:val="20"/>
+              </w:rPr>
+              <w:t>~3 min</w:t>
+            </w:r>
+          </w:p>
+        </w:tc>
+        <w:tc>
+          <w:tcPr>
+            <w:tcW w:type="dxa" w:w="1728"/>
+            <w:shd w:val="clear" w:color="auto" w:fill="F0F0F0"/>
+          </w:tcPr>
+          <w:p>
+            <w:pPr>
+              <w:jc w:val="center"/>
+            </w:pPr>
+            <w:r>
+              <w:rPr>
+                <w:rFonts w:ascii="Times New Roman" w:hAnsi="Times New Roman"/>
+                <w:b w:val="0"/>
+                <w:i w:val="0"/>
+                <w:color w:val="000000"/>
+                <w:sz w:val="20"/>
+              </w:rPr>
+              <w:t>CPU</w:t>
+            </w:r>
+          </w:p>
+        </w:tc>
+        <w:tc>
+          <w:tcPr>
+            <w:tcW w:type="dxa" w:w="2160"/>
+            <w:shd w:val="clear" w:color="auto" w:fill="F0F0F0"/>
+          </w:tcPr>
+          <w:p>
+            <w:pPr>
+              <w:jc w:val="center"/>
+            </w:pPr>
+            <w:r>
+              <w:rPr>
+                <w:rFonts w:ascii="Times New Roman" w:hAnsi="Times New Roman"/>
+                <w:b w:val="0"/>
+                <w:i w:val="0"/>
+                <w:color w:val="000000"/>
+                <w:sz w:val="20"/>
+              </w:rPr>
+              <w:t>data-v2 release</w:t>
+            </w:r>
+          </w:p>
+        </w:tc>
+      </w:tr>
+      <w:tr>
+        <w:tc>
+          <w:tcPr>
+            <w:tcW w:type="dxa" w:w="3888"/>
+            <w:shd w:val="clear" w:color="auto" w:fill="FFFFFF"/>
+          </w:tcPr>
+          <w:p>
+            <w:pPr>
+              <w:jc w:val="left"/>
+            </w:pPr>
+            <w:r>
+              <w:rPr>
+                <w:rFonts w:ascii="Times New Roman" w:hAnsi="Times New Roman"/>
+                <w:b w:val="0"/>
+                <w:i w:val="0"/>
+                <w:color w:val="000000"/>
+                <w:sz w:val="20"/>
+              </w:rPr>
+              <w:t>OpenAlex enrichment (16k DOIs)</w:t>
+            </w:r>
+          </w:p>
+        </w:tc>
+        <w:tc>
+          <w:tcPr>
+            <w:tcW w:type="dxa" w:w="1440"/>
+            <w:shd w:val="clear" w:color="auto" w:fill="FFFFFF"/>
+          </w:tcPr>
+          <w:p>
+            <w:pPr>
+              <w:jc w:val="center"/>
+            </w:pPr>
+            <w:r>
+              <w:rPr>
+                <w:rFonts w:ascii="Times New Roman" w:hAnsi="Times New Roman"/>
+                <w:b w:val="0"/>
+                <w:i w:val="0"/>
+                <w:color w:val="000000"/>
+                <w:sz w:val="20"/>
+              </w:rPr>
+              <w:t>32 s</w:t>
+            </w:r>
+          </w:p>
+        </w:tc>
+        <w:tc>
+          <w:tcPr>
+            <w:tcW w:type="dxa" w:w="1728"/>
+            <w:shd w:val="clear" w:color="auto" w:fill="FFFFFF"/>
+          </w:tcPr>
+          <w:p>
+            <w:pPr>
+              <w:jc w:val="center"/>
+            </w:pPr>
+            <w:r>
+              <w:rPr>
+                <w:rFonts w:ascii="Times New Roman" w:hAnsi="Times New Roman"/>
+                <w:b w:val="0"/>
+                <w:i w:val="0"/>
+                <w:color w:val="000000"/>
+                <w:sz w:val="20"/>
+              </w:rPr>
+              <w:t>CPU + network</w:t>
+            </w:r>
+          </w:p>
+        </w:tc>
+        <w:tc>
+          <w:tcPr>
+            <w:tcW w:type="dxa" w:w="2160"/>
+            <w:shd w:val="clear" w:color="auto" w:fill="FFFFFF"/>
+          </w:tcPr>
+          <w:p>
+            <w:pPr>
+              <w:jc w:val="center"/>
+            </w:pPr>
+            <w:r>
+              <w:rPr>
+                <w:rFonts w:ascii="Times New Roman" w:hAnsi="Times New Roman"/>
+                <w:b w:val="0"/>
+                <w:i w:val="0"/>
+                <w:color w:val="000000"/>
+                <w:sz w:val="20"/>
+              </w:rPr>
+              <w:t>data-v2 release</w:t>
+            </w:r>
+          </w:p>
+        </w:tc>
+      </w:tr>
+      <w:tr>
+        <w:tc>
+          <w:tcPr>
+            <w:tcW w:type="dxa" w:w="3888"/>
+            <w:shd w:val="clear" w:color="auto" w:fill="F0F0F0"/>
+          </w:tcPr>
+          <w:p>
+            <w:pPr>
+              <w:jc w:val="left"/>
+            </w:pPr>
+            <w:r>
+              <w:rPr>
+                <w:rFonts w:ascii="Times New Roman" w:hAnsi="Times New Roman"/>
+                <w:b w:val="0"/>
+                <w:i w:val="0"/>
+                <w:color w:val="000000"/>
+                <w:sz w:val="20"/>
+              </w:rPr>
+              <w:t>SPECTER2 encoding (100k × 768-dim)</w:t>
+            </w:r>
+          </w:p>
+        </w:tc>
+        <w:tc>
+          <w:tcPr>
+            <w:tcW w:type="dxa" w:w="1440"/>
+            <w:shd w:val="clear" w:color="auto" w:fill="F0F0F0"/>
+          </w:tcPr>
+          <w:p>
+            <w:pPr>
+              <w:jc w:val="center"/>
+            </w:pPr>
+            <w:r>
+              <w:rPr>
+                <w:rFonts w:ascii="Times New Roman" w:hAnsi="Times New Roman"/>
+                <w:b w:val="0"/>
+                <w:i w:val="0"/>
+                <w:color w:val="000000"/>
+                <w:sz w:val="20"/>
+              </w:rPr>
+              <w:t>~9.5 min</w:t>
+            </w:r>
+          </w:p>
+        </w:tc>
+        <w:tc>
+          <w:tcPr>
+            <w:tcW w:type="dxa" w:w="1728"/>
+            <w:shd w:val="clear" w:color="auto" w:fill="F0F0F0"/>
+          </w:tcPr>
+          <w:p>
+            <w:pPr>
+              <w:jc w:val="center"/>
+            </w:pPr>
+            <w:r>
+              <w:rPr>
+                <w:rFonts w:ascii="Times New Roman" w:hAnsi="Times New Roman"/>
+                <w:b w:val="0"/>
+                <w:i w:val="0"/>
+                <w:color w:val="000000"/>
+                <w:sz w:val="20"/>
+              </w:rPr>
+              <w:t>RTX 3060</w:t>
+            </w:r>
+          </w:p>
+        </w:tc>
+        <w:tc>
+          <w:tcPr>
+            <w:tcW w:type="dxa" w:w="2160"/>
+            <w:shd w:val="clear" w:color="auto" w:fill="F0F0F0"/>
+          </w:tcPr>
+          <w:p>
+            <w:pPr>
+              <w:jc w:val="center"/>
+            </w:pPr>
+            <w:r>
+              <w:rPr>
+                <w:rFonts w:ascii="Times New Roman" w:hAnsi="Times New Roman"/>
+                <w:b w:val="0"/>
+                <w:i w:val="0"/>
+                <w:color w:val="000000"/>
+                <w:sz w:val="20"/>
+              </w:rPr>
+              <w:t>faiss-index release</w:t>
+            </w:r>
+          </w:p>
+        </w:tc>
+      </w:tr>
+      <w:tr>
+        <w:tc>
+          <w:tcPr>
+            <w:tcW w:type="dxa" w:w="3888"/>
+            <w:shd w:val="clear" w:color="auto" w:fill="FFFFFF"/>
+          </w:tcPr>
+          <w:p>
+            <w:pPr>
+              <w:jc w:val="left"/>
+            </w:pPr>
+            <w:r>
+              <w:rPr>
+                <w:rFonts w:ascii="Times New Roman" w:hAnsi="Times New Roman"/>
+                <w:b w:val="0"/>
+                <w:i w:val="0"/>
+                <w:color w:val="000000"/>
+                <w:sz w:val="20"/>
+              </w:rPr>
+              <w:t>FAISS IVFFlat index build</w:t>
+            </w:r>
+          </w:p>
+        </w:tc>
+        <w:tc>
+          <w:tcPr>
+            <w:tcW w:type="dxa" w:w="1440"/>
+            <w:shd w:val="clear" w:color="auto" w:fill="FFFFFF"/>
+          </w:tcPr>
+          <w:p>
+            <w:pPr>
+              <w:jc w:val="center"/>
+            </w:pPr>
+            <w:r>
+              <w:rPr>
+                <w:rFonts w:ascii="Times New Roman" w:hAnsi="Times New Roman"/>
+                <w:b w:val="0"/>
+                <w:i w:val="0"/>
+                <w:color w:val="000000"/>
+                <w:sz w:val="20"/>
+              </w:rPr>
+              <w:t>&lt;1 min</w:t>
+            </w:r>
+          </w:p>
+        </w:tc>
+        <w:tc>
+          <w:tcPr>
+            <w:tcW w:type="dxa" w:w="1728"/>
+            <w:shd w:val="clear" w:color="auto" w:fill="FFFFFF"/>
+          </w:tcPr>
+          <w:p>
+            <w:pPr>
+              <w:jc w:val="center"/>
+            </w:pPr>
+            <w:r>
+              <w:rPr>
+                <w:rFonts w:ascii="Times New Roman" w:hAnsi="Times New Roman"/>
+                <w:b w:val="0"/>
+                <w:i w:val="0"/>
+                <w:color w:val="000000"/>
+                <w:sz w:val="20"/>
+              </w:rPr>
+              <w:t>RTX 3060</w:t>
+            </w:r>
+          </w:p>
+        </w:tc>
+        <w:tc>
+          <w:tcPr>
+            <w:tcW w:type="dxa" w:w="2160"/>
+            <w:shd w:val="clear" w:color="auto" w:fill="FFFFFF"/>
+          </w:tcPr>
+          <w:p>
+            <w:pPr>
+              <w:jc w:val="center"/>
+            </w:pPr>
+            <w:r>
+              <w:rPr>
+                <w:rFonts w:ascii="Times New Roman" w:hAnsi="Times New Roman"/>
+                <w:b w:val="0"/>
+                <w:i w:val="0"/>
+                <w:color w:val="000000"/>
+                <w:sz w:val="20"/>
+              </w:rPr>
+              <w:t>faiss-index release</w:t>
+            </w:r>
+          </w:p>
+        </w:tc>
+      </w:tr>
+      <w:tr>
+        <w:tc>
+          <w:tcPr>
+            <w:tcW w:type="dxa" w:w="3888"/>
+            <w:shd w:val="clear" w:color="auto" w:fill="F0F0F0"/>
+          </w:tcPr>
+          <w:p>
+            <w:pPr>
+              <w:jc w:val="left"/>
+            </w:pPr>
+            <w:r>
+              <w:rPr>
+                <w:rFonts w:ascii="Times New Roman" w:hAnsi="Times New Roman"/>
+                <w:b w:val="0"/>
+                <w:i w:val="0"/>
+                <w:color w:val="000000"/>
+                <w:sz w:val="20"/>
+              </w:rPr>
+              <w:t>BERTopic UMAP (n_components=5, cosine)</w:t>
+            </w:r>
+          </w:p>
+        </w:tc>
+        <w:tc>
+          <w:tcPr>
+            <w:tcW w:type="dxa" w:w="1440"/>
+            <w:shd w:val="clear" w:color="auto" w:fill="F0F0F0"/>
+          </w:tcPr>
+          <w:p>
+            <w:pPr>
+              <w:jc w:val="center"/>
+            </w:pPr>
+            <w:r>
+              <w:rPr>
+                <w:rFonts w:ascii="Times New Roman" w:hAnsi="Times New Roman"/>
+                <w:b w:val="0"/>
+                <w:i w:val="0"/>
+                <w:color w:val="000000"/>
+                <w:sz w:val="20"/>
+              </w:rPr>
+              <w:t>59 s</w:t>
+            </w:r>
+          </w:p>
+        </w:tc>
+        <w:tc>
+          <w:tcPr>
+            <w:tcW w:type="dxa" w:w="1728"/>
+            <w:shd w:val="clear" w:color="auto" w:fill="F0F0F0"/>
+          </w:tcPr>
+          <w:p>
+            <w:pPr>
+              <w:jc w:val="center"/>
+            </w:pPr>
+            <w:r>
+              <w:rPr>
+                <w:rFonts w:ascii="Times New Roman" w:hAnsi="Times New Roman"/>
+                <w:b w:val="0"/>
+                <w:i w:val="0"/>
+                <w:color w:val="000000"/>
+                <w:sz w:val="20"/>
+              </w:rPr>
+              <w:t>CPU</w:t>
+            </w:r>
+          </w:p>
+        </w:tc>
+        <w:tc>
+          <w:tcPr>
+            <w:tcW w:type="dxa" w:w="2160"/>
+            <w:shd w:val="clear" w:color="auto" w:fill="F0F0F0"/>
+          </w:tcPr>
+          <w:p>
+            <w:pPr>
+              <w:jc w:val="center"/>
+            </w:pPr>
+            <w:r>
+              <w:rPr>
+                <w:rFonts w:ascii="Times New Roman" w:hAnsi="Times New Roman"/>
+                <w:b w:val="0"/>
+                <w:i w:val="0"/>
+                <w:color w:val="000000"/>
+                <w:sz w:val="20"/>
+              </w:rPr>
+              <w:t>fit_log.txt</w:t>
+            </w:r>
+          </w:p>
+        </w:tc>
+      </w:tr>
+      <w:tr>
+        <w:tc>
+          <w:tcPr>
+            <w:tcW w:type="dxa" w:w="3888"/>
+            <w:shd w:val="clear" w:color="auto" w:fill="FFFFFF"/>
+          </w:tcPr>
+          <w:p>
+            <w:pPr>
+              <w:jc w:val="left"/>
+            </w:pPr>
+            <w:r>
+              <w:rPr>
+                <w:rFonts w:ascii="Times New Roman" w:hAnsi="Times New Roman"/>
+                <w:b w:val="0"/>
+                <w:i w:val="0"/>
+                <w:color w:val="000000"/>
+                <w:sz w:val="20"/>
+              </w:rPr>
+              <w:t>BERTopic HDBSCAN clustering</w:t>
+            </w:r>
+          </w:p>
+        </w:tc>
+        <w:tc>
+          <w:tcPr>
+            <w:tcW w:type="dxa" w:w="1440"/>
+            <w:shd w:val="clear" w:color="auto" w:fill="FFFFFF"/>
+          </w:tcPr>
+          <w:p>
+            <w:pPr>
+              <w:jc w:val="center"/>
+            </w:pPr>
+            <w:r>
+              <w:rPr>
+                <w:rFonts w:ascii="Times New Roman" w:hAnsi="Times New Roman"/>
+                <w:b w:val="0"/>
+                <w:i w:val="0"/>
+                <w:color w:val="000000"/>
+                <w:sz w:val="20"/>
+              </w:rPr>
+              <w:t>4 s</w:t>
+            </w:r>
+          </w:p>
+        </w:tc>
+        <w:tc>
+          <w:tcPr>
+            <w:tcW w:type="dxa" w:w="1728"/>
+            <w:shd w:val="clear" w:color="auto" w:fill="FFFFFF"/>
+          </w:tcPr>
+          <w:p>
+            <w:pPr>
+              <w:jc w:val="center"/>
+            </w:pPr>
+            <w:r>
+              <w:rPr>
+                <w:rFonts w:ascii="Times New Roman" w:hAnsi="Times New Roman"/>
+                <w:b w:val="0"/>
+                <w:i w:val="0"/>
+                <w:color w:val="000000"/>
+                <w:sz w:val="20"/>
+              </w:rPr>
+              <w:t>CPU</w:t>
+            </w:r>
+          </w:p>
+        </w:tc>
+        <w:tc>
+          <w:tcPr>
+            <w:tcW w:type="dxa" w:w="2160"/>
+            <w:shd w:val="clear" w:color="auto" w:fill="FFFFFF"/>
+          </w:tcPr>
+          <w:p>
+            <w:pPr>
+              <w:jc w:val="center"/>
+            </w:pPr>
+            <w:r>
+              <w:rPr>
+                <w:rFonts w:ascii="Times New Roman" w:hAnsi="Times New Roman"/>
+                <w:b w:val="0"/>
+                <w:i w:val="0"/>
+                <w:color w:val="000000"/>
+                <w:sz w:val="20"/>
+              </w:rPr>
+              <w:t>fit_log.txt</w:t>
+            </w:r>
+          </w:p>
+        </w:tc>
+      </w:tr>
+      <w:tr>
+        <w:tc>
+          <w:tcPr>
+            <w:tcW w:type="dxa" w:w="3888"/>
+            <w:shd w:val="clear" w:color="auto" w:fill="F0F0F0"/>
+          </w:tcPr>
+          <w:p>
+            <w:pPr>
+              <w:jc w:val="left"/>
+            </w:pPr>
+            <w:r>
+              <w:rPr>
+                <w:rFonts w:ascii="Times New Roman" w:hAnsi="Times New Roman"/>
+                <w:b w:val="0"/>
+                <w:i w:val="0"/>
+                <w:color w:val="000000"/>
+                <w:sz w:val="20"/>
+              </w:rPr>
+              <w:t>BERTopic c-TF-IDF + topic reduction</w:t>
+            </w:r>
+          </w:p>
+        </w:tc>
+        <w:tc>
+          <w:tcPr>
+            <w:tcW w:type="dxa" w:w="1440"/>
+            <w:shd w:val="clear" w:color="auto" w:fill="F0F0F0"/>
+          </w:tcPr>
+          <w:p>
+            <w:pPr>
+              <w:jc w:val="center"/>
+            </w:pPr>
+            <w:r>
+              <w:rPr>
+                <w:rFonts w:ascii="Times New Roman" w:hAnsi="Times New Roman"/>
+                <w:b w:val="0"/>
+                <w:i w:val="0"/>
+                <w:color w:val="000000"/>
+                <w:sz w:val="20"/>
+              </w:rPr>
+              <w:t>27 s</w:t>
+            </w:r>
+          </w:p>
+        </w:tc>
+        <w:tc>
+          <w:tcPr>
+            <w:tcW w:type="dxa" w:w="1728"/>
+            <w:shd w:val="clear" w:color="auto" w:fill="F0F0F0"/>
+          </w:tcPr>
+          <w:p>
+            <w:pPr>
+              <w:jc w:val="center"/>
+            </w:pPr>
+            <w:r>
+              <w:rPr>
+                <w:rFonts w:ascii="Times New Roman" w:hAnsi="Times New Roman"/>
+                <w:b w:val="0"/>
+                <w:i w:val="0"/>
+                <w:color w:val="000000"/>
+                <w:sz w:val="20"/>
+              </w:rPr>
+              <w:t>CPU</w:t>
+            </w:r>
+          </w:p>
+        </w:tc>
+        <w:tc>
+          <w:tcPr>
+            <w:tcW w:type="dxa" w:w="2160"/>
+            <w:shd w:val="clear" w:color="auto" w:fill="F0F0F0"/>
+          </w:tcPr>
+          <w:p>
+            <w:pPr>
+              <w:jc w:val="center"/>
+            </w:pPr>
+            <w:r>
+              <w:rPr>
+                <w:rFonts w:ascii="Times New Roman" w:hAnsi="Times New Roman"/>
+                <w:b w:val="0"/>
+                <w:i w:val="0"/>
+                <w:color w:val="000000"/>
+                <w:sz w:val="20"/>
+              </w:rPr>
+              <w:t>fit_log.txt</w:t>
+            </w:r>
+          </w:p>
+        </w:tc>
+      </w:tr>
+      <w:tr>
+        <w:tc>
+          <w:tcPr>
+            <w:tcW w:type="dxa" w:w="3888"/>
+            <w:shd w:val="clear" w:color="auto" w:fill="FFFFFF"/>
+          </w:tcPr>
+          <w:p>
+            <w:pPr>
+              <w:jc w:val="left"/>
+            </w:pPr>
+            <w:r>
+              <w:rPr>
+                <w:rFonts w:ascii="Times New Roman" w:hAnsi="Times New Roman"/>
+                <w:b w:val="0"/>
+                <w:i w:val="0"/>
+                <w:color w:val="000000"/>
+                <w:sz w:val="20"/>
+              </w:rPr>
+              <w:t>BERTopic coherence scoring (gensim C_V)</w:t>
+            </w:r>
+          </w:p>
+        </w:tc>
+        <w:tc>
+          <w:tcPr>
+            <w:tcW w:type="dxa" w:w="1440"/>
+            <w:shd w:val="clear" w:color="auto" w:fill="FFFFFF"/>
+          </w:tcPr>
+          <w:p>
+            <w:pPr>
+              <w:jc w:val="center"/>
+            </w:pPr>
+            <w:r>
+              <w:rPr>
+                <w:rFonts w:ascii="Times New Roman" w:hAnsi="Times New Roman"/>
+                <w:b w:val="0"/>
+                <w:i w:val="0"/>
+                <w:color w:val="000000"/>
+                <w:sz w:val="20"/>
+              </w:rPr>
+              <w:t>~90 s</w:t>
+            </w:r>
+          </w:p>
+        </w:tc>
+        <w:tc>
+          <w:tcPr>
+            <w:tcW w:type="dxa" w:w="1728"/>
+            <w:shd w:val="clear" w:color="auto" w:fill="FFFFFF"/>
+          </w:tcPr>
+          <w:p>
+            <w:pPr>
+              <w:jc w:val="center"/>
+            </w:pPr>
+            <w:r>
+              <w:rPr>
+                <w:rFonts w:ascii="Times New Roman" w:hAnsi="Times New Roman"/>
+                <w:b w:val="0"/>
+                <w:i w:val="0"/>
+                <w:color w:val="000000"/>
+                <w:sz w:val="20"/>
+              </w:rPr>
+              <w:t>CPU × 7 cores</w:t>
+            </w:r>
+          </w:p>
+        </w:tc>
+        <w:tc>
+          <w:tcPr>
+            <w:tcW w:type="dxa" w:w="2160"/>
+            <w:shd w:val="clear" w:color="auto" w:fill="FFFFFF"/>
+          </w:tcPr>
+          <w:p>
+            <w:pPr>
+              <w:jc w:val="center"/>
+            </w:pPr>
+            <w:r>
+              <w:rPr>
+                <w:rFonts w:ascii="Times New Roman" w:hAnsi="Times New Roman"/>
+                <w:b w:val="0"/>
+                <w:i w:val="0"/>
+                <w:color w:val="000000"/>
+                <w:sz w:val="20"/>
+              </w:rPr>
+              <w:t>fit_log.txt</w:t>
+            </w:r>
+          </w:p>
+        </w:tc>
+      </w:tr>
+      <w:tr>
+        <w:tc>
+          <w:tcPr>
+            <w:tcW w:type="dxa" w:w="3888"/>
+            <w:shd w:val="clear" w:color="auto" w:fill="F0F0F0"/>
+          </w:tcPr>
+          <w:p>
+            <w:pPr>
+              <w:jc w:val="left"/>
+            </w:pPr>
+            <w:r>
+              <w:rPr>
+                <w:rFonts w:ascii="Times New Roman" w:hAnsi="Times New Roman"/>
+                <w:b w:val="0"/>
+                <w:i w:val="0"/>
+                <w:color w:val="000000"/>
+                <w:sz w:val="20"/>
+              </w:rPr>
+              <w:t>Total BERTopic training (on precomputed embs)</w:t>
+            </w:r>
+          </w:p>
+        </w:tc>
+        <w:tc>
+          <w:tcPr>
+            <w:tcW w:type="dxa" w:w="1440"/>
+            <w:shd w:val="clear" w:color="auto" w:fill="F0F0F0"/>
+          </w:tcPr>
+          <w:p>
+            <w:pPr>
+              <w:jc w:val="center"/>
+            </w:pPr>
+            <w:r>
+              <w:rPr>
+                <w:rFonts w:ascii="Times New Roman" w:hAnsi="Times New Roman"/>
+                <w:b w:val="0"/>
+                <w:i w:val="0"/>
+                <w:color w:val="000000"/>
+                <w:sz w:val="20"/>
+              </w:rPr>
+              <w:t>~3 min</w:t>
+            </w:r>
+          </w:p>
+        </w:tc>
+        <w:tc>
+          <w:tcPr>
+            <w:tcW w:type="dxa" w:w="1728"/>
+            <w:shd w:val="clear" w:color="auto" w:fill="F0F0F0"/>
+          </w:tcPr>
+          <w:p>
+            <w:pPr>
+              <w:jc w:val="center"/>
+            </w:pPr>
+            <w:r>
+              <w:rPr>
+                <w:rFonts w:ascii="Times New Roman" w:hAnsi="Times New Roman"/>
+                <w:b w:val="0"/>
+                <w:i w:val="0"/>
+                <w:color w:val="000000"/>
+                <w:sz w:val="20"/>
+              </w:rPr>
+              <w:t>CPU</w:t>
+            </w:r>
+          </w:p>
+        </w:tc>
+        <w:tc>
+          <w:tcPr>
+            <w:tcW w:type="dxa" w:w="2160"/>
+            <w:shd w:val="clear" w:color="auto" w:fill="F0F0F0"/>
+          </w:tcPr>
+          <w:p>
+            <w:pPr>
+              <w:jc w:val="center"/>
+            </w:pPr>
+            <w:r>
+              <w:rPr>
+                <w:rFonts w:ascii="Times New Roman" w:hAnsi="Times New Roman"/>
+                <w:b w:val="0"/>
+                <w:i w:val="0"/>
+                <w:color w:val="000000"/>
+                <w:sz w:val="20"/>
+              </w:rPr>
+              <w:t>fit_log.txt</w:t>
+            </w:r>
+          </w:p>
+        </w:tc>
+      </w:tr>
+    </w:tbl>
+    <w:p/>
+    <w:p>
+      <w:pPr>
+        <w:spacing w:after="200"/>
+        <w:jc w:val="center"/>
+      </w:pPr>
+      <w:r>
+        <w:rPr>
+          <w:rFonts w:ascii="Times New Roman" w:hAnsi="Times New Roman"/>
+          <w:b w:val="0"/>
+          <w:i/>
+          <w:color w:val="000000"/>
+          <w:sz w:val="18"/>
+        </w:rPr>
+        <w:t>Table 7.  One-time offline training and index-build times.  All artifacts are persisted; reproduction requires only loading from disk.</w:t>
+      </w:r>
+    </w:p>
     <w:p>
       <w:pPr>
         <w:spacing w:before="240" w:after="80"/>

</xml_diff>